<commit_message>
Add school header and page-numbered footer to summative test
Co-Authored-By: Claude Sonnet 5.5 <noreply@anthropic.com>
Claude-Session: https://claude.ai/code/session_01XGaSdvZnPrwFBLWXThUSJE
</commit_message>
<xml_diff>
--- a/Summative_Test_Exponents_and_Radicals.docx
+++ b/Summative_Test_Exponents_and_Radicals.docx
@@ -16748,8 +16748,10 @@
       </w:r>
     </w:p>
     <w:sectPr>
+      <w:headerReference w:type="default" r:id="rId7"/>
+      <w:footerReference w:type="default" r:id="rId8"/>
       <w:pgSz w:w="12240" w:h="15840" w:orient="portrait"/>
-      <w:pgMar w:top="1080" w:right="1080" w:bottom="1080" w:left="1080" w:header="708" w:footer="708" w:gutter="0"/>
+      <w:pgMar w:top="1800" w:right="1080" w:bottom="1200" w:left="1080" w:header="360" w:footer="500" w:gutter="0"/>
       <w:pgNumType/>
       <w:docGrid w:linePitch="360"/>
     </w:sectPr>
@@ -16798,6 +16800,57 @@
 </w:endnotes>
 </file>
 
+<file path=word/footer1.xml><?xml version="1.0" encoding="utf-8"?>
+<w:ftr xmlns:wpc="http://schemas.microsoft.com/office/word/2010/wordprocessingCanvas" xmlns:mc="http://schemas.openxmlformats.org/markup-compatibility/2006" xmlns:o="urn:schemas-microsoft-com:office:office" xmlns:r="http://schemas.openxmlformats.org/officeDocument/2006/relationships" xmlns:m="http://schemas.openxmlformats.org/officeDocument/2006/math" xmlns:v="urn:schemas-microsoft-com:vml" xmlns:wp14="http://schemas.microsoft.com/office/word/2010/wordprocessingDrawing" xmlns:wp="http://schemas.openxmlformats.org/drawingml/2006/wordprocessingDrawing" xmlns:w10="urn:schemas-microsoft-com:office:word" xmlns:w="http://schemas.openxmlformats.org/wordprocessingml/2006/main" xmlns:w14="http://schemas.microsoft.com/office/word/2010/wordml" xmlns:w15="http://schemas.microsoft.com/office/word/2012/wordml" xmlns:wpg="http://schemas.microsoft.com/office/word/2010/wordprocessingGroup" xmlns:wpi="http://schemas.microsoft.com/office/word/2010/wordprocessingInk" xmlns:wne="http://schemas.microsoft.com/office/word/2006/wordml" xmlns:wps="http://schemas.microsoft.com/office/word/2010/wordprocessingShape">
+  <w:p>
+    <w:pPr>
+      <w:pBdr>
+        <w:top w:val="single" w:color="000000" w:sz="6" w:space="4"/>
+      </w:pBdr>
+      <w:jc w:val="center"/>
+    </w:pPr>
+    <w:r>
+      <w:rPr>
+        <w:rFonts w:ascii="Times New Roman" w:cs="Times New Roman" w:eastAsia="Times New Roman" w:hAnsi="Times New Roman"/>
+        <w:sz w:val="18"/>
+        <w:szCs w:val="18"/>
+      </w:rPr>
+      <w:t xml:space="preserve">Ozamiz City National High School  |  Summative Test: Exponents and Radicals  |  Page </w:t>
+    </w:r>
+    <w:r>
+      <w:rPr>
+        <w:rFonts w:ascii="Times New Roman" w:cs="Times New Roman" w:eastAsia="Times New Roman" w:hAnsi="Times New Roman"/>
+        <w:sz w:val="18"/>
+        <w:szCs w:val="18"/>
+      </w:rPr>
+      <w:fldChar w:fldCharType="begin"/>
+      <w:instrText xml:space="preserve">PAGE</w:instrText>
+      <w:fldChar w:fldCharType="separate"/>
+      <w:fldChar w:fldCharType="end"/>
+    </w:r>
+    <w:r>
+      <w:rPr>
+        <w:rFonts w:ascii="Times New Roman" w:cs="Times New Roman" w:eastAsia="Times New Roman" w:hAnsi="Times New Roman"/>
+        <w:sz w:val="18"/>
+        <w:szCs w:val="18"/>
+      </w:rPr>
+      <w:t xml:space="preserve"> of </w:t>
+    </w:r>
+    <w:r>
+      <w:rPr>
+        <w:rFonts w:ascii="Times New Roman" w:cs="Times New Roman" w:eastAsia="Times New Roman" w:hAnsi="Times New Roman"/>
+        <w:sz w:val="18"/>
+        <w:szCs w:val="18"/>
+      </w:rPr>
+      <w:fldChar w:fldCharType="begin"/>
+      <w:instrText xml:space="preserve">NUMPAGES</w:instrText>
+      <w:fldChar w:fldCharType="separate"/>
+      <w:fldChar w:fldCharType="end"/>
+    </w:r>
+  </w:p>
+</w:ftr>
+</file>
+
 <file path=word/footnotes.xml><?xml version="1.0" encoding="utf-8"?>
 <w:footnotes xmlns:wpc="http://schemas.microsoft.com/office/word/2010/wordprocessingCanvas" xmlns:mc="http://schemas.openxmlformats.org/markup-compatibility/2006" xmlns:o="urn:schemas-microsoft-com:office:office" xmlns:r="http://schemas.openxmlformats.org/officeDocument/2006/relationships" xmlns:m="http://schemas.openxmlformats.org/officeDocument/2006/math" xmlns:v="urn:schemas-microsoft-com:vml" xmlns:wp14="http://schemas.microsoft.com/office/word/2010/wordprocessingDrawing" xmlns:wp="http://schemas.openxmlformats.org/drawingml/2006/wordprocessingDrawing" xmlns:w10="urn:schemas-microsoft-com:office:word" xmlns:w="http://schemas.openxmlformats.org/wordprocessingml/2006/main" xmlns:w14="http://schemas.microsoft.com/office/word/2010/wordml" xmlns:w15="http://schemas.microsoft.com/office/word/2012/wordml" xmlns:wpg="http://schemas.microsoft.com/office/word/2010/wordprocessingGroup" xmlns:wpi="http://schemas.microsoft.com/office/word/2010/wordprocessingInk" xmlns:wne="http://schemas.microsoft.com/office/word/2006/wordml" xmlns:wps="http://schemas.microsoft.com/office/word/2010/wordprocessingShape" mc:Ignorable="w14 w15 wp14">
   <w:footnote w:type="separator" w:id="-1">
@@ -16833,6 +16886,56 @@
     </w:p>
   </w:footnote>
 </w:footnotes>
+</file>
+
+<file path=word/header1.xml><?xml version="1.0" encoding="utf-8"?>
+<w:hdr xmlns:wpc="http://schemas.microsoft.com/office/word/2010/wordprocessingCanvas" xmlns:mc="http://schemas.openxmlformats.org/markup-compatibility/2006" xmlns:o="urn:schemas-microsoft-com:office:office" xmlns:r="http://schemas.openxmlformats.org/officeDocument/2006/relationships" xmlns:m="http://schemas.openxmlformats.org/officeDocument/2006/math" xmlns:v="urn:schemas-microsoft-com:vml" xmlns:wp14="http://schemas.microsoft.com/office/word/2010/wordprocessingDrawing" xmlns:wp="http://schemas.openxmlformats.org/drawingml/2006/wordprocessingDrawing" xmlns:w10="urn:schemas-microsoft-com:office:word" xmlns:w="http://schemas.openxmlformats.org/wordprocessingml/2006/main" xmlns:w14="http://schemas.microsoft.com/office/word/2010/wordml" xmlns:w15="http://schemas.microsoft.com/office/word/2012/wordml" xmlns:wpg="http://schemas.microsoft.com/office/word/2010/wordprocessingGroup" xmlns:wpi="http://schemas.microsoft.com/office/word/2010/wordprocessingInk" xmlns:wne="http://schemas.microsoft.com/office/word/2006/wordml" xmlns:wps="http://schemas.microsoft.com/office/word/2010/wordprocessingShape" xmlns:cx="http://schemas.microsoft.com/office/drawing/2014/chartex" xmlns:cx1="http://schemas.microsoft.com/office/drawing/2015/9/8/chartex" xmlns:cx2="http://schemas.microsoft.com/office/drawing/2015/10/21/chartex" xmlns:cx3="http://schemas.microsoft.com/office/drawing/2016/5/9/chartex" xmlns:cx4="http://schemas.microsoft.com/office/drawing/2016/5/10/chartex" xmlns:cx5="http://schemas.microsoft.com/office/drawing/2016/5/11/chartex" xmlns:cx6="http://schemas.microsoft.com/office/drawing/2016/5/12/chartex" xmlns:cx7="http://schemas.microsoft.com/office/drawing/2016/5/13/chartex" xmlns:cx8="http://schemas.microsoft.com/office/drawing/2016/5/14/chartex" xmlns:w16cid="http://schemas.microsoft.com/office/word/2016/wordml/cid" xmlns:w16se="http://schemas.microsoft.com/office/word/2015/wordml/symex">
+  <w:p>
+    <w:pPr>
+      <w:jc w:val="center"/>
+    </w:pPr>
+    <w:r>
+      <w:drawing>
+        <wp:inline distT="0" distB="0" distL="0" distR="0">
+          <wp:extent cx="2095500" cy="1066800"/>
+          <wp:effectExtent t="0" r="0" b="0" l="0"/>
+          <wp:docPr id="1" name="header" descr="Department of Education, Region X, Schools Division of Ozamiz City, Ozamiz City National High School" title="DepEd header"/>
+          <wp:cNvGraphicFramePr>
+            <a:graphicFrameLocks xmlns:a="http://schemas.openxmlformats.org/drawingml/2006/main" noChangeAspect="1"/>
+          </wp:cNvGraphicFramePr>
+          <a:graphic xmlns:a="http://schemas.openxmlformats.org/drawingml/2006/main">
+            <a:graphicData uri="http://schemas.openxmlformats.org/drawingml/2006/picture">
+              <pic:pic xmlns:pic="http://schemas.openxmlformats.org/drawingml/2006/picture">
+                <pic:nvPicPr>
+                  <pic:cNvPr id="0" name="" descr=""/>
+                  <pic:cNvPicPr>
+                    <a:picLocks noChangeAspect="1" noChangeArrowheads="1"/>
+                  </pic:cNvPicPr>
+                </pic:nvPicPr>
+                <pic:blipFill>
+                  <a:blip r:embed="rId0" cstate="none"/>
+                  <a:srcRect/>
+                  <a:stretch>
+                    <a:fillRect/>
+                  </a:stretch>
+                </pic:blipFill>
+                <pic:spPr bwMode="auto">
+                  <a:xfrm>
+                    <a:off x="0" y="0"/>
+                    <a:ext cx="2095500" cy="1066800"/>
+                  </a:xfrm>
+                  <a:prstGeom prst="rect">
+                    <a:avLst/>
+                  </a:prstGeom>
+                </pic:spPr>
+              </pic:pic>
+            </a:graphicData>
+          </a:graphic>
+        </wp:inline>
+      </w:drawing>
+    </w:r>
+  </w:p>
+</w:hdr>
 </file>
 
 <file path=word/numbering.xml><?xml version="1.0" encoding="utf-8"?>

</xml_diff>

<commit_message>
Use school contact footer image on every page of summative test
Co-Authored-By: Claude Sonnet 5.5 <noreply@anthropic.com>
Claude-Session: https://claude.ai/code/session_01XGaSdvZnPrwFBLWXThUSJE
</commit_message>
<xml_diff>
--- a/Summative_Test_Exponents_and_Radicals.docx
+++ b/Summative_Test_Exponents_and_Radicals.docx
@@ -16751,7 +16751,7 @@
       <w:headerReference w:type="default" r:id="rId7"/>
       <w:footerReference w:type="default" r:id="rId8"/>
       <w:pgSz w:w="12240" w:h="15840" w:orient="portrait"/>
-      <w:pgMar w:top="1800" w:right="1080" w:bottom="1200" w:left="1080" w:header="360" w:footer="500" w:gutter="0"/>
+      <w:pgMar w:top="1800" w:right="1080" w:bottom="1700" w:left="1080" w:header="360" w:footer="300" w:gutter="0"/>
       <w:pgNumType/>
       <w:docGrid w:linePitch="360"/>
     </w:sectPr>
@@ -16810,18 +16810,63 @@
       <w:jc w:val="center"/>
     </w:pPr>
     <w:r>
+      <w:drawing>
+        <wp:inline distT="0" distB="0" distL="0" distR="0">
+          <wp:extent cx="3810000" cy="714375"/>
+          <wp:effectExtent t="0" r="0" b="0" l="0"/>
+          <wp:docPr id="1" name="footer" descr="School address and contact details" title="DepEd footer"/>
+          <wp:cNvGraphicFramePr>
+            <a:graphicFrameLocks xmlns:a="http://schemas.openxmlformats.org/drawingml/2006/main" noChangeAspect="1"/>
+          </wp:cNvGraphicFramePr>
+          <a:graphic xmlns:a="http://schemas.openxmlformats.org/drawingml/2006/main">
+            <a:graphicData uri="http://schemas.openxmlformats.org/drawingml/2006/picture">
+              <pic:pic xmlns:pic="http://schemas.openxmlformats.org/drawingml/2006/picture">
+                <pic:nvPicPr>
+                  <pic:cNvPr id="0" name="" descr=""/>
+                  <pic:cNvPicPr>
+                    <a:picLocks noChangeAspect="1" noChangeArrowheads="1"/>
+                  </pic:cNvPicPr>
+                </pic:nvPicPr>
+                <pic:blipFill>
+                  <a:blip r:embed="rId0" cstate="none"/>
+                  <a:srcRect/>
+                  <a:stretch>
+                    <a:fillRect/>
+                  </a:stretch>
+                </pic:blipFill>
+                <pic:spPr bwMode="auto">
+                  <a:xfrm>
+                    <a:off x="0" y="0"/>
+                    <a:ext cx="3810000" cy="714375"/>
+                  </a:xfrm>
+                  <a:prstGeom prst="rect">
+                    <a:avLst/>
+                  </a:prstGeom>
+                </pic:spPr>
+              </pic:pic>
+            </a:graphicData>
+          </a:graphic>
+        </wp:inline>
+      </w:drawing>
+    </w:r>
+  </w:p>
+  <w:p>
+    <w:pPr>
+      <w:jc w:val="center"/>
+    </w:pPr>
+    <w:r>
       <w:rPr>
         <w:rFonts w:ascii="Times New Roman" w:cs="Times New Roman" w:eastAsia="Times New Roman" w:hAnsi="Times New Roman"/>
-        <w:sz w:val="18"/>
-        <w:szCs w:val="18"/>
+        <w:sz w:val="16"/>
+        <w:szCs w:val="16"/>
       </w:rPr>
-      <w:t xml:space="preserve">Ozamiz City National High School  |  Summative Test: Exponents and Radicals  |  Page </w:t>
+      <w:t xml:space="preserve">Page </w:t>
     </w:r>
     <w:r>
       <w:rPr>
         <w:rFonts w:ascii="Times New Roman" w:cs="Times New Roman" w:eastAsia="Times New Roman" w:hAnsi="Times New Roman"/>
-        <w:sz w:val="18"/>
-        <w:szCs w:val="18"/>
+        <w:sz w:val="16"/>
+        <w:szCs w:val="16"/>
       </w:rPr>
       <w:fldChar w:fldCharType="begin"/>
       <w:instrText xml:space="preserve">PAGE</w:instrText>
@@ -16831,16 +16876,16 @@
     <w:r>
       <w:rPr>
         <w:rFonts w:ascii="Times New Roman" w:cs="Times New Roman" w:eastAsia="Times New Roman" w:hAnsi="Times New Roman"/>
-        <w:sz w:val="18"/>
-        <w:szCs w:val="18"/>
+        <w:sz w:val="16"/>
+        <w:szCs w:val="16"/>
       </w:rPr>
       <w:t xml:space="preserve"> of </w:t>
     </w:r>
     <w:r>
       <w:rPr>
         <w:rFonts w:ascii="Times New Roman" w:cs="Times New Roman" w:eastAsia="Times New Roman" w:hAnsi="Times New Roman"/>
-        <w:sz w:val="18"/>
-        <w:szCs w:val="18"/>
+        <w:sz w:val="16"/>
+        <w:szCs w:val="16"/>
       </w:rPr>
       <w:fldChar w:fldCharType="begin"/>
       <w:instrText xml:space="preserve">NUMPAGES</w:instrText>

</xml_diff>